<commit_message>
Add high-resolution presentation cue card image for Cancio's part
</commit_message>
<xml_diff>
--- a/Academic_and_Financial_Management_Portal_Demo_Script_Updated.docx
+++ b/Academic_and_Financial_Management_Portal_Demo_Script_Updated.docx
@@ -367,11 +367,14 @@
       </w:r>
     </w:p>
     <w:p/>
+    <w:p/>
+    <w:p/>
     <w:p>
       <w:pPr>
         <w:pStyle w:val="Heading1"/>
       </w:pPr>
       <w:r>
+        <w:lastRenderedPageBreak/>
         <w:t>5. Finance &amp; Perpetual DALTA Card (finance.html, cashin.html, pay-tuition.html)</w:t>
       </w:r>
     </w:p>
@@ -398,7 +401,6 @@
           <w:b/>
           <w:bCs/>
         </w:rPr>
-        <w:lastRenderedPageBreak/>
         <w:t xml:space="preserve">On-Screen Action: </w:t>
       </w:r>
       <w:r>

</xml_diff>

<commit_message>
Integrate official UPHSD seal on login panel and all portal page sidebars
</commit_message>
<xml_diff>
--- a/Academic_and_Financial_Management_Portal_Demo_Script_Updated.docx
+++ b/Academic_and_Financial_Management_Portal_Demo_Script_Updated.docx
@@ -53,15 +53,7 @@
         <w:t xml:space="preserve">On-Screen Action: </w:t>
       </w:r>
       <w:r>
-        <w:t xml:space="preserve">Display the login screen, enter student credentials, click 'Sign </w:t>
-      </w:r>
-      <w:proofErr w:type="gramStart"/>
-      <w:r>
-        <w:t>In</w:t>
-      </w:r>
-      <w:proofErr w:type="gramEnd"/>
-      <w:r>
-        <w:t xml:space="preserve"> to Portal'.</w:t>
+        <w:t>Display the login screen, enter student credentials, click 'Sign In to Portal'.</w:t>
       </w:r>
     </w:p>
     <w:p>
@@ -81,7 +73,13 @@
         </w:numPr>
       </w:pPr>
       <w:r>
-        <w:t>• Molino Campus Branding: Official university crest, campus title (Molino Campus, City of Bacoor), and motto ("Character Building is Nation Building").</w:t>
+        <w:t xml:space="preserve">• Molino Campus Branding: </w:t>
+      </w:r>
+      <w:r>
+        <w:t>C</w:t>
+      </w:r>
+      <w:r>
+        <w:t>ampus title (Molino Campus, City of Bacoor), and motto ("Character Building is Nation Building").</w:t>
       </w:r>
     </w:p>
     <w:p>
@@ -404,15 +402,7 @@
         <w:t xml:space="preserve">On-Screen Action: </w:t>
       </w:r>
       <w:r>
-        <w:t xml:space="preserve">Click Finance, show virtual card, click 'Cash </w:t>
-      </w:r>
-      <w:proofErr w:type="gramStart"/>
-      <w:r>
-        <w:t>In</w:t>
-      </w:r>
-      <w:proofErr w:type="gramEnd"/>
-      <w:r>
-        <w:t xml:space="preserve"> to Card', simulate a ₱1,000 top-up, show generated Official Receipt, then show updated ledger on finance page.</w:t>
+        <w:t>Click Finance, show virtual card, click 'Cash In to Card', simulate a ₱1,000 top-up, show generated Official Receipt, then show updated ledger on finance page.</w:t>
       </w:r>
     </w:p>
     <w:p>
@@ -444,35 +434,19 @@
         </w:numPr>
       </w:pPr>
       <w:r>
-        <w:t xml:space="preserve">• Two Dedicated Subpage Buttons: Clean interface with two dedicated action buttons: 'Cash </w:t>
-      </w:r>
-      <w:proofErr w:type="gramStart"/>
-      <w:r>
-        <w:t>In</w:t>
-      </w:r>
-      <w:proofErr w:type="gramEnd"/>
-      <w:r>
-        <w:t xml:space="preserve"> to Card' and 'Pay Tuition Fee'.</w:t>
-      </w:r>
-    </w:p>
-    <w:p>
-      <w:pPr>
-        <w:pStyle w:val="ListParagraph"/>
-        <w:numPr>
-          <w:ilvl w:val="0"/>
-          <w:numId w:val="1"/>
-        </w:numPr>
-      </w:pPr>
-      <w:r>
-        <w:t xml:space="preserve">• Self-Service Cash-In (Zero Cashier Line): 24/7 top-ups via </w:t>
-      </w:r>
-      <w:proofErr w:type="spellStart"/>
-      <w:r>
-        <w:t>GCash</w:t>
-      </w:r>
-      <w:proofErr w:type="spellEnd"/>
-      <w:r>
-        <w:t>, Maya, Bank Transfer, or 7-Eleven—eliminating the need to bring physical cash or wait in cashier lines.</w:t>
+        <w:t>• Two Dedicated Subpage Buttons: Clean interface with two dedicated action buttons: 'Cash In to Card' and 'Pay Tuition Fee'.</w:t>
+      </w:r>
+    </w:p>
+    <w:p>
+      <w:pPr>
+        <w:pStyle w:val="ListParagraph"/>
+        <w:numPr>
+          <w:ilvl w:val="0"/>
+          <w:numId w:val="1"/>
+        </w:numPr>
+      </w:pPr>
+      <w:r>
+        <w:t>• Self-Service Cash-In (Zero Cashier Line): 24/7 top-ups via GCash, Maya, Bank Transfer, or 7-Eleven—eliminating the need to bring physical cash or wait in cashier lines.</w:t>
       </w:r>
     </w:p>
     <w:p>

</xml_diff>